<commit_message>
update in pdf form page for the bolder once text colors
</commit_message>
<xml_diff>
--- a/QuotationApp.API/Generated/Q-20260910-8d7ed4a7.docx
+++ b/QuotationApp.API/Generated/Q-20260910-8d7ed4a7.docx
@@ -1437,7 +1437,7 @@
           </w:tcPr>
           <w:p>
             <w:r>
-              <w:t>Discount (2.00%):</w:t>
+              <w:t>Discount (3.00%):</w:t>
             </w:r>
           </w:p>
         </w:tc>
@@ -1453,7 +1453,7 @@
           </w:tcPr>
           <w:p>
             <w:r>
-              <w:t>1,280.00</w:t>
+              <w:t>1,920.00</w:t>
             </w:r>
           </w:p>
         </w:tc>
@@ -1509,7 +1509,7 @@
               <w:rPr>
                 <w:b/>
               </w:rPr>
-              <w:t>62,720.00</w:t>
+              <w:t>62,080.00</w:t>
             </w:r>
           </w:p>
         </w:tc>
@@ -1796,7 +1796,7 @@
           </w:tcPr>
           <w:p>
             <w:r>
-              <w:t>Discount (2.00%):</w:t>
+              <w:t>Discount (3.00%):</w:t>
             </w:r>
           </w:p>
         </w:tc>
@@ -1812,7 +1812,7 @@
           </w:tcPr>
           <w:p>
             <w:r>
-              <w:t>1,280.00</w:t>
+              <w:t>1,920.00</w:t>
             </w:r>
           </w:p>
         </w:tc>
@@ -1868,7 +1868,7 @@
               <w:rPr>
                 <w:b/>
               </w:rPr>
-              <w:t>62,720.00</w:t>
+              <w:t>62,080.00</w:t>
             </w:r>
           </w:p>
         </w:tc>

</xml_diff>